<commit_message>
Di learnable and start value
</commit_message>
<xml_diff>
--- a/report/residual/report_residual.docx
+++ b/report/residual/report_residual.docx
@@ -406,15 +406,7 @@
                 <w:sz w:val="20"/>
                 <w:szCs w:val="20"/>
               </w:rPr>
-              <w:t>Test</w:t>
-            </w:r>
-            <w:r>
-              <w:rPr>
-                <w:rFonts w:cs="B Nazanin"/>
-                <w:sz w:val="20"/>
-                <w:szCs w:val="20"/>
-              </w:rPr>
-              <w:t>set</w:t>
+              <w:t>Testset</w:t>
             </w:r>
             <w:proofErr w:type="spellEnd"/>
             <w:r>
@@ -785,7 +777,7 @@
                 <w:sz w:val="20"/>
                 <w:szCs w:val="20"/>
               </w:rPr>
-              <w:t xml:space="preserve"> (SNN)</w:t>
+              <w:t xml:space="preserve"> (SNN)- </w:t>
             </w:r>
             <w:r>
               <w:rPr>
@@ -793,7 +785,15 @@
                 <w:sz w:val="20"/>
                 <w:szCs w:val="20"/>
               </w:rPr>
-              <w:t>- try 1</w:t>
+              <w:t>T</w:t>
+            </w:r>
+            <w:r>
+              <w:rPr>
+                <w:rFonts w:cs="B Nazanin"/>
+                <w:sz w:val="20"/>
+                <w:szCs w:val="20"/>
+              </w:rPr>
+              <w:t>ry 1</w:t>
             </w:r>
           </w:p>
         </w:tc>
@@ -880,7 +880,7 @@
                 <w:sz w:val="20"/>
                 <w:szCs w:val="20"/>
               </w:rPr>
-              <w:t xml:space="preserve"> (SNN)- try </w:t>
+              <w:t xml:space="preserve"> (SNN)- </w:t>
             </w:r>
             <w:r>
               <w:rPr>
@@ -888,7 +888,15 @@
                 <w:sz w:val="20"/>
                 <w:szCs w:val="20"/>
               </w:rPr>
-              <w:t>2</w:t>
+              <w:t>T</w:t>
+            </w:r>
+            <w:r>
+              <w:rPr>
+                <w:rFonts w:cs="B Nazanin"/>
+                <w:sz w:val="20"/>
+                <w:szCs w:val="20"/>
+              </w:rPr>
+              <w:t>ry 2</w:t>
             </w:r>
           </w:p>
         </w:tc>
@@ -931,8 +939,6 @@
               <w:jc w:val="center"/>
               <w:rPr>
                 <w:rFonts w:cs="B Nazanin"/>
-                <w:b/>
-                <w:bCs/>
                 <w:sz w:val="20"/>
                 <w:szCs w:val="20"/>
               </w:rPr>
@@ -940,8 +946,6 @@
             <w:r>
               <w:rPr>
                 <w:rFonts w:cs="B Nazanin"/>
-                <w:b/>
-                <w:bCs/>
                 <w:sz w:val="20"/>
                 <w:szCs w:val="20"/>
               </w:rPr>
@@ -950,37 +954,361 @@
           </w:p>
         </w:tc>
       </w:tr>
+      <w:tr>
+        <w:trPr>
+          <w:trHeight w:val="247"/>
+          <w:jc w:val="center"/>
+        </w:trPr>
+        <w:tc>
+          <w:tcPr>
+            <w:tcW w:w="2068" w:type="dxa"/>
+            <w:shd w:val="clear" w:color="auto" w:fill="F6C5AC" w:themeFill="accent2" w:themeFillTint="66"/>
+          </w:tcPr>
+          <w:p>
+            <w:pPr>
+              <w:bidi/>
+              <w:jc w:val="center"/>
+              <w:rPr>
+                <w:rFonts w:cs="B Nazanin"/>
+                <w:sz w:val="20"/>
+                <w:szCs w:val="20"/>
+              </w:rPr>
+            </w:pPr>
+            <w:r>
+              <w:rPr>
+                <w:rFonts w:cs="B Nazanin"/>
+                <w:sz w:val="20"/>
+                <w:szCs w:val="20"/>
+              </w:rPr>
+              <w:t>Ours</w:t>
+            </w:r>
+            <w:r>
+              <w:rPr>
+                <w:rFonts w:cs="B Nazanin"/>
+                <w:sz w:val="20"/>
+                <w:szCs w:val="20"/>
+              </w:rPr>
+              <w:t xml:space="preserve"> (SNN)- Try 3</w:t>
+            </w:r>
+            <w:r>
+              <w:rPr>
+                <w:rFonts w:cs="B Nazanin"/>
+                <w:sz w:val="20"/>
+                <w:szCs w:val="20"/>
+              </w:rPr>
+              <w:t>-</w:t>
+            </w:r>
+            <w:r>
+              <w:rPr>
+                <w:rFonts w:cs="B Nazanin"/>
+                <w:sz w:val="20"/>
+                <w:szCs w:val="20"/>
+              </w:rPr>
+              <w:t>A</w:t>
+            </w:r>
+          </w:p>
+        </w:tc>
+        <w:tc>
+          <w:tcPr>
+            <w:tcW w:w="6732" w:type="dxa"/>
+            <w:shd w:val="clear" w:color="auto" w:fill="F6C5AC" w:themeFill="accent2" w:themeFillTint="66"/>
+          </w:tcPr>
+          <w:p>
+            <w:pPr>
+              <w:bidi/>
+              <w:jc w:val="center"/>
+              <w:rPr>
+                <w:rFonts w:cs="B Nazanin"/>
+                <w:sz w:val="22"/>
+                <w:szCs w:val="22"/>
+              </w:rPr>
+            </w:pPr>
+            <w:r>
+              <w:rPr>
+                <w:rFonts w:cs="B Nazanin"/>
+                <w:sz w:val="22"/>
+                <w:szCs w:val="22"/>
+              </w:rPr>
+              <w:t>94.11</w:t>
+            </w:r>
+          </w:p>
+        </w:tc>
+        <w:tc>
+          <w:tcPr>
+            <w:tcW w:w="1905" w:type="dxa"/>
+            <w:gridSpan w:val="2"/>
+            <w:shd w:val="clear" w:color="auto" w:fill="F6C5AC" w:themeFill="accent2" w:themeFillTint="66"/>
+          </w:tcPr>
+          <w:p>
+            <w:pPr>
+              <w:bidi/>
+              <w:jc w:val="center"/>
+              <w:rPr>
+                <w:rFonts w:cs="B Nazanin"/>
+                <w:b/>
+                <w:bCs/>
+                <w:sz w:val="20"/>
+                <w:szCs w:val="20"/>
+              </w:rPr>
+            </w:pPr>
+            <w:r>
+              <w:rPr>
+                <w:rFonts w:cs="B Nazanin"/>
+                <w:b/>
+                <w:bCs/>
+                <w:sz w:val="20"/>
+                <w:szCs w:val="20"/>
+              </w:rPr>
+              <w:t>38.18</w:t>
+            </w:r>
+          </w:p>
+        </w:tc>
+      </w:tr>
+      <w:tr>
+        <w:trPr>
+          <w:trHeight w:val="247"/>
+          <w:jc w:val="center"/>
+        </w:trPr>
+        <w:tc>
+          <w:tcPr>
+            <w:tcW w:w="2068" w:type="dxa"/>
+            <w:shd w:val="clear" w:color="auto" w:fill="F6C5AC" w:themeFill="accent2" w:themeFillTint="66"/>
+          </w:tcPr>
+          <w:p>
+            <w:pPr>
+              <w:jc w:val="center"/>
+              <w:rPr>
+                <w:rFonts w:cs="B Nazanin"/>
+                <w:sz w:val="20"/>
+                <w:szCs w:val="20"/>
+              </w:rPr>
+            </w:pPr>
+            <w:r>
+              <w:rPr>
+                <w:rFonts w:cs="B Nazanin"/>
+                <w:sz w:val="20"/>
+                <w:szCs w:val="20"/>
+              </w:rPr>
+              <w:t>Ours</w:t>
+            </w:r>
+            <w:r>
+              <w:rPr>
+                <w:rFonts w:cs="B Nazanin"/>
+                <w:sz w:val="20"/>
+                <w:szCs w:val="20"/>
+              </w:rPr>
+              <w:t xml:space="preserve"> (SNN)- Try</w:t>
+            </w:r>
+            <w:r>
+              <w:rPr>
+                <w:rFonts w:cs="B Nazanin" w:hint="cs"/>
+                <w:sz w:val="20"/>
+                <w:szCs w:val="20"/>
+                <w:rtl/>
+              </w:rPr>
+              <w:t xml:space="preserve"> </w:t>
+            </w:r>
+            <w:r>
+              <w:rPr>
+                <w:rFonts w:cs="B Nazanin"/>
+                <w:sz w:val="20"/>
+                <w:szCs w:val="20"/>
+              </w:rPr>
+              <w:t>3</w:t>
+            </w:r>
+            <w:r>
+              <w:rPr>
+                <w:rFonts w:cs="B Nazanin"/>
+                <w:sz w:val="20"/>
+                <w:szCs w:val="20"/>
+              </w:rPr>
+              <w:t>-</w:t>
+            </w:r>
+            <w:r>
+              <w:rPr>
+                <w:rFonts w:cs="B Nazanin"/>
+                <w:sz w:val="20"/>
+                <w:szCs w:val="20"/>
+              </w:rPr>
+              <w:t>B</w:t>
+            </w:r>
+          </w:p>
+        </w:tc>
+        <w:tc>
+          <w:tcPr>
+            <w:tcW w:w="6732" w:type="dxa"/>
+            <w:shd w:val="clear" w:color="auto" w:fill="F6C5AC" w:themeFill="accent2" w:themeFillTint="66"/>
+          </w:tcPr>
+          <w:p>
+            <w:pPr>
+              <w:bidi/>
+              <w:jc w:val="center"/>
+              <w:rPr>
+                <w:rFonts w:cs="B Nazanin"/>
+                <w:sz w:val="22"/>
+                <w:szCs w:val="22"/>
+              </w:rPr>
+            </w:pPr>
+            <w:r>
+              <w:rPr>
+                <w:rFonts w:cs="B Nazanin"/>
+                <w:sz w:val="22"/>
+                <w:szCs w:val="22"/>
+              </w:rPr>
+              <w:t>94.43</w:t>
+            </w:r>
+          </w:p>
+        </w:tc>
+        <w:tc>
+          <w:tcPr>
+            <w:tcW w:w="1905" w:type="dxa"/>
+            <w:gridSpan w:val="2"/>
+            <w:shd w:val="clear" w:color="auto" w:fill="F6C5AC" w:themeFill="accent2" w:themeFillTint="66"/>
+          </w:tcPr>
+          <w:p>
+            <w:pPr>
+              <w:bidi/>
+              <w:jc w:val="center"/>
+              <w:rPr>
+                <w:rFonts w:cs="B Nazanin"/>
+                <w:b/>
+                <w:bCs/>
+                <w:sz w:val="20"/>
+                <w:szCs w:val="20"/>
+              </w:rPr>
+            </w:pPr>
+            <w:r>
+              <w:rPr>
+                <w:rFonts w:cs="B Nazanin"/>
+                <w:b/>
+                <w:bCs/>
+                <w:sz w:val="20"/>
+                <w:szCs w:val="20"/>
+              </w:rPr>
+              <w:t>38.01</w:t>
+            </w:r>
+          </w:p>
+        </w:tc>
+      </w:tr>
+      <w:tr>
+        <w:trPr>
+          <w:trHeight w:val="247"/>
+          <w:jc w:val="center"/>
+        </w:trPr>
+        <w:tc>
+          <w:tcPr>
+            <w:tcW w:w="2068" w:type="dxa"/>
+            <w:shd w:val="clear" w:color="auto" w:fill="F6C5AC" w:themeFill="accent2" w:themeFillTint="66"/>
+          </w:tcPr>
+          <w:p>
+            <w:pPr>
+              <w:jc w:val="center"/>
+              <w:rPr>
+                <w:rFonts w:cs="B Nazanin"/>
+                <w:sz w:val="20"/>
+                <w:szCs w:val="20"/>
+              </w:rPr>
+            </w:pPr>
+            <w:r>
+              <w:rPr>
+                <w:rFonts w:cs="B Nazanin"/>
+                <w:sz w:val="20"/>
+                <w:szCs w:val="20"/>
+              </w:rPr>
+              <w:t>Ours</w:t>
+            </w:r>
+            <w:r>
+              <w:rPr>
+                <w:rFonts w:cs="B Nazanin"/>
+                <w:sz w:val="20"/>
+                <w:szCs w:val="20"/>
+              </w:rPr>
+              <w:t xml:space="preserve"> (SNN)- Try</w:t>
+            </w:r>
+            <w:r>
+              <w:rPr>
+                <w:rFonts w:cs="B Nazanin" w:hint="cs"/>
+                <w:sz w:val="20"/>
+                <w:szCs w:val="20"/>
+                <w:rtl/>
+              </w:rPr>
+              <w:t xml:space="preserve"> </w:t>
+            </w:r>
+            <w:r>
+              <w:rPr>
+                <w:rFonts w:cs="B Nazanin"/>
+                <w:sz w:val="20"/>
+                <w:szCs w:val="20"/>
+              </w:rPr>
+              <w:t>3-</w:t>
+            </w:r>
+            <w:r>
+              <w:rPr>
+                <w:rFonts w:cs="B Nazanin"/>
+                <w:sz w:val="20"/>
+                <w:szCs w:val="20"/>
+              </w:rPr>
+              <w:t>C</w:t>
+            </w:r>
+          </w:p>
+        </w:tc>
+        <w:tc>
+          <w:tcPr>
+            <w:tcW w:w="6732" w:type="dxa"/>
+            <w:shd w:val="clear" w:color="auto" w:fill="F6C5AC" w:themeFill="accent2" w:themeFillTint="66"/>
+          </w:tcPr>
+          <w:p>
+            <w:pPr>
+              <w:bidi/>
+              <w:jc w:val="center"/>
+              <w:rPr>
+                <w:rFonts w:cs="B Nazanin"/>
+                <w:sz w:val="22"/>
+                <w:szCs w:val="22"/>
+              </w:rPr>
+            </w:pPr>
+            <w:r>
+              <w:rPr>
+                <w:rFonts w:cs="B Nazanin"/>
+                <w:sz w:val="22"/>
+                <w:szCs w:val="22"/>
+              </w:rPr>
+              <w:t>94.05</w:t>
+            </w:r>
+          </w:p>
+        </w:tc>
+        <w:tc>
+          <w:tcPr>
+            <w:tcW w:w="1905" w:type="dxa"/>
+            <w:gridSpan w:val="2"/>
+            <w:shd w:val="clear" w:color="auto" w:fill="F6C5AC" w:themeFill="accent2" w:themeFillTint="66"/>
+          </w:tcPr>
+          <w:p>
+            <w:pPr>
+              <w:bidi/>
+              <w:jc w:val="center"/>
+              <w:rPr>
+                <w:rFonts w:cs="B Nazanin"/>
+                <w:b/>
+                <w:bCs/>
+                <w:sz w:val="20"/>
+                <w:szCs w:val="20"/>
+              </w:rPr>
+            </w:pPr>
+            <w:r>
+              <w:rPr>
+                <w:rFonts w:cs="B Nazanin"/>
+                <w:b/>
+                <w:bCs/>
+                <w:sz w:val="20"/>
+                <w:szCs w:val="20"/>
+              </w:rPr>
+              <w:t>38.50</w:t>
+            </w:r>
+          </w:p>
+        </w:tc>
+      </w:tr>
     </w:tbl>
-    <w:p>
-      <w:pPr>
-        <w:rPr>
-          <w:rFonts w:cs="B Nazanin"/>
-          <w:sz w:val="20"/>
-          <w:szCs w:val="20"/>
-          <w:rtl/>
-        </w:rPr>
-      </w:pPr>
-    </w:p>
-    <w:p>
-      <w:pPr>
-        <w:rPr>
-          <w:rFonts w:cs="B Nazanin"/>
-          <w:sz w:val="20"/>
-          <w:szCs w:val="20"/>
-          <w:rtl/>
-        </w:rPr>
-      </w:pPr>
-    </w:p>
-    <w:p>
-      <w:pPr>
-        <w:rPr>
-          <w:rFonts w:cs="B Nazanin"/>
-          <w:sz w:val="20"/>
-          <w:szCs w:val="20"/>
-          <w:rtl/>
-        </w:rPr>
-      </w:pPr>
-    </w:p>
     <w:p>
       <w:pPr>
         <w:rPr>
@@ -1248,10 +1576,10 @@
             <v:path o:extrusionok="f" gradientshapeok="t" o:connecttype="rect"/>
             <o:lock v:ext="edit" aspectratio="t"/>
           </v:shapetype>
-          <v:shape id="_x0000_i1047" type="#_x0000_t75" style="width:468.2pt;height:636.05pt" o:ole="">
+          <v:shape id="_x0000_i1025" type="#_x0000_t75" style="width:468pt;height:636.3pt" o:ole="">
             <v:imagedata r:id="rId4" o:title=""/>
           </v:shape>
-          <o:OLEObject Type="Embed" ProgID="Word.OpenDocumentText.12" ShapeID="_x0000_i1047" DrawAspect="Content" ObjectID="_1827210139" r:id="rId5"/>
+          <o:OLEObject Type="Embed" ProgID="Word.OpenDocumentText.12" ShapeID="_x0000_i1025" DrawAspect="Content" ObjectID="_1827481664" r:id="rId5"/>
         </w:object>
       </w:r>
     </w:p>
@@ -1887,31 +2215,405 @@
       <w:pPr>
         <w:bidi/>
         <w:rPr>
+          <w:rFonts w:cs="B Nazanin"/>
+          <w:sz w:val="20"/>
+          <w:szCs w:val="20"/>
+          <w:rtl/>
+          <w:lang w:bidi="fa-IR"/>
+        </w:rPr>
+      </w:pPr>
+      <w:r>
+        <w:rPr>
+          <w:rFonts w:cs="B Nazanin"/>
+          <w:sz w:val="20"/>
+          <w:szCs w:val="20"/>
+          <w:lang w:bidi="fa-IR"/>
+        </w:rPr>
+        <w:t xml:space="preserve">Out = </w:t>
+      </w:r>
+      <w:proofErr w:type="gramStart"/>
+      <w:r>
+        <w:rPr>
+          <w:rFonts w:cs="B Nazanin"/>
+          <w:sz w:val="20"/>
+          <w:szCs w:val="20"/>
+          <w:lang w:bidi="fa-IR"/>
+        </w:rPr>
+        <w:t>minimum(</w:t>
+      </w:r>
+      <w:proofErr w:type="spellStart"/>
+      <w:r>
+        <w:rPr>
+          <w:rFonts w:cs="B Nazanin"/>
+          <w:sz w:val="20"/>
+          <w:szCs w:val="20"/>
+          <w:lang w:bidi="fa-IR"/>
+        </w:rPr>
+        <w:t>ti</w:t>
+      </w:r>
+      <w:proofErr w:type="spellEnd"/>
+      <w:r>
+        <w:rPr>
+          <w:rFonts w:cs="B Nazanin"/>
+          <w:sz w:val="20"/>
+          <w:szCs w:val="20"/>
+          <w:lang w:bidi="fa-IR"/>
+        </w:rPr>
+        <w:t xml:space="preserve"> ,</w:t>
+      </w:r>
+      <w:proofErr w:type="gramEnd"/>
+      <w:r>
+        <w:rPr>
+          <w:rFonts w:cs="B Nazanin"/>
+          <w:sz w:val="20"/>
+          <w:szCs w:val="20"/>
+          <w:lang w:bidi="fa-IR"/>
+        </w:rPr>
+        <w:t xml:space="preserve"> </w:t>
+      </w:r>
+      <w:proofErr w:type="spellStart"/>
+      <w:r>
+        <w:rPr>
+          <w:rFonts w:cs="B Nazanin"/>
+          <w:sz w:val="20"/>
+          <w:szCs w:val="20"/>
+          <w:lang w:bidi="fa-IR"/>
+        </w:rPr>
+        <w:t>tj</w:t>
+      </w:r>
+      <w:proofErr w:type="spellEnd"/>
+      <w:r>
+        <w:rPr>
+          <w:rFonts w:cs="B Nazanin"/>
+          <w:sz w:val="20"/>
+          <w:szCs w:val="20"/>
+          <w:lang w:bidi="fa-IR"/>
+        </w:rPr>
+        <w:t>)</w:t>
+      </w:r>
+      <w:r>
+        <w:rPr>
+          <w:rFonts w:cs="B Nazanin"/>
+          <w:sz w:val="20"/>
+          <w:szCs w:val="20"/>
+          <w:rtl/>
+          <w:lang w:bidi="fa-IR"/>
+        </w:rPr>
+        <w:br/>
+      </w:r>
+      <w:r>
+        <w:rPr>
           <w:rFonts w:cs="B Nazanin" w:hint="cs"/>
-          <w:sz w:val="20"/>
-          <w:szCs w:val="20"/>
-          <w:rtl/>
-          <w:lang w:bidi="fa-IR"/>
-        </w:rPr>
-      </w:pPr>
-      <w:r>
-        <w:rPr>
-          <w:rFonts w:cs="B Nazanin"/>
-          <w:sz w:val="20"/>
-          <w:szCs w:val="20"/>
-          <w:lang w:bidi="fa-IR"/>
-        </w:rPr>
-        <w:t xml:space="preserve">Out = </w:t>
-      </w:r>
-      <w:proofErr w:type="gramStart"/>
-      <w:r>
-        <w:rPr>
-          <w:rFonts w:cs="B Nazanin"/>
-          <w:sz w:val="20"/>
-          <w:szCs w:val="20"/>
-          <w:lang w:bidi="fa-IR"/>
-        </w:rPr>
-        <w:t>minimum(</w:t>
+          <w:b/>
+          <w:bCs/>
+          <w:sz w:val="20"/>
+          <w:szCs w:val="20"/>
+          <w:rtl/>
+          <w:lang w:bidi="fa-IR"/>
+        </w:rPr>
+        <w:t>این کار باعث شد که دقت مدل به مقدار 95.96 درصد برسد</w:t>
+      </w:r>
+    </w:p>
+    <w:p>
+      <w:pPr>
+        <w:bidi/>
+        <w:rPr>
+          <w:rFonts w:cs="B Nazanin"/>
+          <w:sz w:val="20"/>
+          <w:szCs w:val="20"/>
+          <w:lang w:bidi="fa-IR"/>
+        </w:rPr>
+      </w:pPr>
+    </w:p>
+    <w:p>
+      <w:pPr>
+        <w:bidi/>
+        <w:jc w:val="right"/>
+        <w:rPr>
+          <w:rFonts w:cs="Calibri"/>
+          <w:sz w:val="20"/>
+          <w:szCs w:val="20"/>
+          <w:lang w:bidi="fa-IR"/>
+        </w:rPr>
+      </w:pPr>
+    </w:p>
+    <w:p>
+      <w:pPr>
+        <w:bidi/>
+        <w:jc w:val="right"/>
+        <w:rPr>
+          <w:rFonts w:cs="Calibri"/>
+          <w:sz w:val="20"/>
+          <w:szCs w:val="20"/>
+          <w:rtl/>
+          <w:lang w:bidi="fa-IR"/>
+        </w:rPr>
+      </w:pPr>
+    </w:p>
+    <w:p>
+      <w:pPr>
+        <w:bidi/>
+        <w:jc w:val="right"/>
+        <w:rPr>
+          <w:rFonts w:cs="Calibri"/>
+          <w:sz w:val="20"/>
+          <w:szCs w:val="20"/>
+          <w:rtl/>
+          <w:lang w:bidi="fa-IR"/>
+        </w:rPr>
+      </w:pPr>
+    </w:p>
+    <w:p>
+      <w:pPr>
+        <w:bidi/>
+        <w:jc w:val="right"/>
+        <w:rPr>
+          <w:rFonts w:cs="Calibri"/>
+          <w:sz w:val="20"/>
+          <w:szCs w:val="20"/>
+          <w:rtl/>
+          <w:lang w:bidi="fa-IR"/>
+        </w:rPr>
+      </w:pPr>
+    </w:p>
+    <w:p>
+      <w:pPr>
+        <w:bidi/>
+        <w:jc w:val="right"/>
+        <w:rPr>
+          <w:rFonts w:cs="Calibri"/>
+          <w:sz w:val="20"/>
+          <w:szCs w:val="20"/>
+          <w:rtl/>
+          <w:lang w:bidi="fa-IR"/>
+        </w:rPr>
+      </w:pPr>
+    </w:p>
+    <w:p>
+      <w:pPr>
+        <w:bidi/>
+        <w:jc w:val="right"/>
+        <w:rPr>
+          <w:rFonts w:cs="Calibri"/>
+          <w:sz w:val="20"/>
+          <w:szCs w:val="20"/>
+          <w:rtl/>
+          <w:lang w:bidi="fa-IR"/>
+        </w:rPr>
+      </w:pPr>
+    </w:p>
+    <w:p>
+      <w:pPr>
+        <w:bidi/>
+        <w:jc w:val="right"/>
+        <w:rPr>
+          <w:rFonts w:cs="Calibri"/>
+          <w:sz w:val="20"/>
+          <w:szCs w:val="20"/>
+          <w:rtl/>
+          <w:lang w:bidi="fa-IR"/>
+        </w:rPr>
+      </w:pPr>
+    </w:p>
+    <w:p>
+      <w:pPr>
+        <w:bidi/>
+        <w:jc w:val="right"/>
+        <w:rPr>
+          <w:rFonts w:cs="Calibri"/>
+          <w:sz w:val="20"/>
+          <w:szCs w:val="20"/>
+          <w:rtl/>
+          <w:lang w:bidi="fa-IR"/>
+        </w:rPr>
+      </w:pPr>
+    </w:p>
+    <w:p>
+      <w:pPr>
+        <w:bidi/>
+        <w:jc w:val="right"/>
+        <w:rPr>
+          <w:rFonts w:cs="Calibri"/>
+          <w:sz w:val="20"/>
+          <w:szCs w:val="20"/>
+          <w:rtl/>
+          <w:lang w:bidi="fa-IR"/>
+        </w:rPr>
+      </w:pPr>
+    </w:p>
+    <w:p>
+      <w:pPr>
+        <w:bidi/>
+        <w:jc w:val="right"/>
+        <w:rPr>
+          <w:rFonts w:cs="Calibri"/>
+          <w:sz w:val="20"/>
+          <w:szCs w:val="20"/>
+          <w:rtl/>
+          <w:lang w:bidi="fa-IR"/>
+        </w:rPr>
+      </w:pPr>
+    </w:p>
+    <w:p>
+      <w:pPr>
+        <w:bidi/>
+        <w:jc w:val="right"/>
+        <w:rPr>
+          <w:rFonts w:cs="Calibri"/>
+          <w:sz w:val="20"/>
+          <w:szCs w:val="20"/>
+          <w:rtl/>
+          <w:lang w:bidi="fa-IR"/>
+        </w:rPr>
+      </w:pPr>
+    </w:p>
+    <w:p>
+      <w:pPr>
+        <w:bidi/>
+        <w:jc w:val="right"/>
+        <w:rPr>
+          <w:rFonts w:cs="Calibri"/>
+          <w:sz w:val="20"/>
+          <w:szCs w:val="20"/>
+          <w:rtl/>
+          <w:lang w:bidi="fa-IR"/>
+        </w:rPr>
+      </w:pPr>
+    </w:p>
+    <w:p>
+      <w:pPr>
+        <w:bidi/>
+        <w:jc w:val="right"/>
+        <w:rPr>
+          <w:rFonts w:cs="Calibri"/>
+          <w:sz w:val="20"/>
+          <w:szCs w:val="20"/>
+          <w:rtl/>
+          <w:lang w:bidi="fa-IR"/>
+        </w:rPr>
+      </w:pPr>
+    </w:p>
+    <w:p>
+      <w:pPr>
+        <w:bidi/>
+        <w:jc w:val="right"/>
+        <w:rPr>
+          <w:rFonts w:cs="Calibri"/>
+          <w:sz w:val="20"/>
+          <w:szCs w:val="20"/>
+          <w:lang w:bidi="fa-IR"/>
+        </w:rPr>
+      </w:pPr>
+    </w:p>
+    <w:p>
+      <w:pPr>
+        <w:bidi/>
+        <w:rPr>
+          <w:rFonts w:cs="B Nazanin"/>
+          <w:b/>
+          <w:bCs/>
+          <w:sz w:val="20"/>
+          <w:szCs w:val="20"/>
+          <w:lang w:bidi="fa-IR"/>
+        </w:rPr>
+      </w:pPr>
+      <w:r>
+        <w:rPr>
+          <w:rFonts w:cs="B Nazanin" w:hint="cs"/>
+          <w:b/>
+          <w:bCs/>
+          <w:sz w:val="20"/>
+          <w:szCs w:val="20"/>
+          <w:rtl/>
+          <w:lang w:bidi="fa-IR"/>
+        </w:rPr>
+        <w:lastRenderedPageBreak/>
+        <w:t xml:space="preserve">حالت </w:t>
+      </w:r>
+      <w:r>
+        <w:rPr>
+          <w:rFonts w:cs="B Nazanin"/>
+          <w:b/>
+          <w:bCs/>
+          <w:sz w:val="20"/>
+          <w:szCs w:val="20"/>
+          <w:lang w:bidi="fa-IR"/>
+        </w:rPr>
+        <w:t xml:space="preserve">Try </w:t>
+      </w:r>
+      <w:r>
+        <w:rPr>
+          <w:rFonts w:cs="B Nazanin"/>
+          <w:b/>
+          <w:bCs/>
+          <w:sz w:val="20"/>
+          <w:szCs w:val="20"/>
+          <w:lang w:bidi="fa-IR"/>
+        </w:rPr>
+        <w:t>3</w:t>
+      </w:r>
+      <w:r>
+        <w:rPr>
+          <w:rFonts w:cs="B Nazanin" w:hint="cs"/>
+          <w:b/>
+          <w:bCs/>
+          <w:sz w:val="20"/>
+          <w:szCs w:val="20"/>
+          <w:rtl/>
+          <w:lang w:bidi="fa-IR"/>
+        </w:rPr>
+        <w:t xml:space="preserve"> :</w:t>
+      </w:r>
+    </w:p>
+    <w:p>
+      <w:pPr>
+        <w:bidi/>
+        <w:rPr>
+          <w:rFonts w:cs="B Nazanin"/>
+          <w:sz w:val="20"/>
+          <w:szCs w:val="20"/>
+          <w:rtl/>
+          <w:lang w:bidi="fa-IR"/>
+        </w:rPr>
+      </w:pPr>
+      <w:r>
+        <w:rPr>
+          <w:rFonts w:cs="B Nazanin" w:hint="cs"/>
+          <w:sz w:val="20"/>
+          <w:szCs w:val="20"/>
+          <w:rtl/>
+          <w:lang w:bidi="fa-IR"/>
+        </w:rPr>
+        <w:t xml:space="preserve">در این </w:t>
+      </w:r>
+      <w:r>
+        <w:rPr>
+          <w:rFonts w:cs="B Nazanin" w:hint="cs"/>
+          <w:sz w:val="20"/>
+          <w:szCs w:val="20"/>
+          <w:rtl/>
+          <w:lang w:bidi="fa-IR"/>
+        </w:rPr>
+        <w:t xml:space="preserve">آزمایش برخلاف حالت </w:t>
+      </w:r>
+      <w:r>
+        <w:rPr>
+          <w:rFonts w:cs="B Nazanin"/>
+          <w:sz w:val="20"/>
+          <w:szCs w:val="20"/>
+          <w:lang w:bidi="fa-IR"/>
+        </w:rPr>
+        <w:t>Try 2</w:t>
+      </w:r>
+      <w:r>
+        <w:rPr>
+          <w:rFonts w:cs="B Nazanin" w:hint="cs"/>
+          <w:sz w:val="20"/>
+          <w:szCs w:val="20"/>
+          <w:rtl/>
+          <w:lang w:bidi="fa-IR"/>
+        </w:rPr>
+        <w:t xml:space="preserve"> که مقدار </w:t>
       </w:r>
       <w:proofErr w:type="spellStart"/>
       <w:r>
@@ -1921,81 +2623,880 @@
           <w:szCs w:val="20"/>
           <w:lang w:bidi="fa-IR"/>
         </w:rPr>
-        <w:t>ti</w:t>
+        <w:t>D_i</w:t>
       </w:r>
       <w:proofErr w:type="spellEnd"/>
       <w:r>
         <w:rPr>
-          <w:rFonts w:cs="B Nazanin"/>
-          <w:sz w:val="20"/>
-          <w:szCs w:val="20"/>
-          <w:lang w:bidi="fa-IR"/>
-        </w:rPr>
-        <w:t xml:space="preserve"> ,</w:t>
-      </w:r>
-      <w:proofErr w:type="gramEnd"/>
-      <w:r>
-        <w:rPr>
-          <w:rFonts w:cs="B Nazanin"/>
-          <w:sz w:val="20"/>
-          <w:szCs w:val="20"/>
-          <w:lang w:bidi="fa-IR"/>
+          <w:rFonts w:cs="B Nazanin" w:hint="cs"/>
+          <w:sz w:val="20"/>
+          <w:szCs w:val="20"/>
+          <w:rtl/>
+          <w:lang w:bidi="fa-IR"/>
+        </w:rPr>
+        <w:t xml:space="preserve"> برای </w:t>
+      </w:r>
+      <w:r>
+        <w:rPr>
+          <w:rFonts w:cs="B Nazanin"/>
+          <w:sz w:val="20"/>
+          <w:szCs w:val="20"/>
+          <w:lang w:bidi="fa-IR"/>
+        </w:rPr>
+        <w:t xml:space="preserve">threshold </w:t>
+      </w:r>
+      <w:r>
+        <w:rPr>
+          <w:rFonts w:cs="B Nazanin" w:hint="cs"/>
+          <w:sz w:val="20"/>
+          <w:szCs w:val="20"/>
+          <w:rtl/>
+          <w:lang w:bidi="fa-IR"/>
+        </w:rPr>
+        <w:t xml:space="preserve"> برابر صفر بود، در این حالت </w:t>
+      </w:r>
+      <w:r>
+        <w:rPr>
+          <w:rFonts w:cs="B Nazanin"/>
+          <w:sz w:val="20"/>
+          <w:szCs w:val="20"/>
+          <w:lang w:bidi="fa-IR"/>
+        </w:rPr>
+        <w:t>learnable</w:t>
+      </w:r>
+      <w:r>
+        <w:rPr>
+          <w:rFonts w:cs="B Nazanin" w:hint="cs"/>
+          <w:sz w:val="20"/>
+          <w:szCs w:val="20"/>
+          <w:rtl/>
+          <w:lang w:bidi="fa-IR"/>
+        </w:rPr>
+        <w:t xml:space="preserve"> کردم تا مدل در طول فرایند آموزش، این مقدار را بدست آورد. </w:t>
+      </w:r>
+    </w:p>
+    <w:p>
+      <w:pPr>
+        <w:shd w:val="clear" w:color="auto" w:fill="FFFFFF"/>
+        <w:spacing w:after="0" w:line="390" w:lineRule="atLeast"/>
+      </w:pPr>
+      <w:r>
+        <w:rPr>
+          <w:rFonts w:ascii="Consolas" w:eastAsia="Times New Roman" w:hAnsi="Consolas" w:cs="Times New Roman"/>
+          <w:color w:val="3B3B3B"/>
+          <w:kern w:val="0"/>
+          <w:sz w:val="18"/>
+          <w:szCs w:val="18"/>
+        </w:rPr>
+        <w:t xml:space="preserve">    </w:t>
+      </w:r>
+      <w:r>
+        <w:rPr>
+          <w:rFonts w:ascii="Consolas" w:eastAsia="Times New Roman" w:hAnsi="Consolas" w:cs="Times New Roman"/>
+          <w:color w:val="001080"/>
+          <w:kern w:val="0"/>
+          <w:sz w:val="18"/>
+          <w:szCs w:val="18"/>
+        </w:rPr>
+        <w:t>threshold</w:t>
+      </w:r>
+      <w:r>
+        <w:rPr>
+          <w:rFonts w:ascii="Consolas" w:eastAsia="Times New Roman" w:hAnsi="Consolas" w:cs="Times New Roman"/>
+          <w:color w:val="3B3B3B"/>
+          <w:kern w:val="0"/>
+          <w:sz w:val="18"/>
+          <w:szCs w:val="18"/>
         </w:rPr>
         <w:t xml:space="preserve"> </w:t>
       </w:r>
+      <w:r>
+        <w:rPr>
+          <w:rFonts w:ascii="Consolas" w:eastAsia="Times New Roman" w:hAnsi="Consolas" w:cs="Times New Roman"/>
+          <w:color w:val="000000"/>
+          <w:kern w:val="0"/>
+          <w:sz w:val="18"/>
+          <w:szCs w:val="18"/>
+        </w:rPr>
+        <w:t>=</w:t>
+      </w:r>
+      <w:r>
+        <w:rPr>
+          <w:rFonts w:ascii="Consolas" w:eastAsia="Times New Roman" w:hAnsi="Consolas" w:cs="Times New Roman"/>
+          <w:color w:val="3B3B3B"/>
+          <w:kern w:val="0"/>
+          <w:sz w:val="18"/>
+          <w:szCs w:val="18"/>
+        </w:rPr>
+        <w:t xml:space="preserve"> </w:t>
+      </w:r>
       <w:proofErr w:type="spellStart"/>
       <w:r>
         <w:rPr>
-          <w:rFonts w:cs="B Nazanin"/>
-          <w:sz w:val="20"/>
-          <w:szCs w:val="20"/>
-          <w:lang w:bidi="fa-IR"/>
-        </w:rPr>
-        <w:t>tj</w:t>
+          <w:rFonts w:ascii="Consolas" w:eastAsia="Times New Roman" w:hAnsi="Consolas" w:cs="Times New Roman"/>
+          <w:color w:val="001080"/>
+          <w:kern w:val="0"/>
+          <w:sz w:val="18"/>
+          <w:szCs w:val="18"/>
+        </w:rPr>
+        <w:t>t_max</w:t>
       </w:r>
       <w:proofErr w:type="spellEnd"/>
       <w:r>
         <w:rPr>
-          <w:rFonts w:cs="B Nazanin"/>
-          <w:sz w:val="20"/>
-          <w:szCs w:val="20"/>
+          <w:rFonts w:ascii="Consolas" w:eastAsia="Times New Roman" w:hAnsi="Consolas" w:cs="Times New Roman"/>
+          <w:color w:val="3B3B3B"/>
+          <w:kern w:val="0"/>
+          <w:sz w:val="18"/>
+          <w:szCs w:val="18"/>
+        </w:rPr>
+        <w:t xml:space="preserve"> </w:t>
+      </w:r>
+      <w:r>
+        <w:rPr>
+          <w:rFonts w:ascii="Consolas" w:eastAsia="Times New Roman" w:hAnsi="Consolas" w:cs="Times New Roman"/>
+          <w:color w:val="000000"/>
+          <w:kern w:val="0"/>
+          <w:sz w:val="18"/>
+          <w:szCs w:val="18"/>
+        </w:rPr>
+        <w:t>-</w:t>
+      </w:r>
+      <w:r>
+        <w:rPr>
+          <w:rFonts w:ascii="Consolas" w:eastAsia="Times New Roman" w:hAnsi="Consolas" w:cs="Times New Roman"/>
+          <w:color w:val="3B3B3B"/>
+          <w:kern w:val="0"/>
+          <w:sz w:val="18"/>
+          <w:szCs w:val="18"/>
+        </w:rPr>
+        <w:t xml:space="preserve"> </w:t>
+      </w:r>
+      <w:proofErr w:type="spellStart"/>
+      <w:r>
+        <w:rPr>
+          <w:rFonts w:ascii="Consolas" w:eastAsia="Times New Roman" w:hAnsi="Consolas" w:cs="Times New Roman"/>
+          <w:color w:val="001080"/>
+          <w:kern w:val="0"/>
+          <w:sz w:val="18"/>
+          <w:szCs w:val="18"/>
+        </w:rPr>
+        <w:t>t_min</w:t>
+      </w:r>
+      <w:proofErr w:type="spellEnd"/>
+      <w:r>
+        <w:rPr>
+          <w:rFonts w:ascii="Consolas" w:eastAsia="Times New Roman" w:hAnsi="Consolas" w:cs="Times New Roman"/>
+          <w:color w:val="3B3B3B"/>
+          <w:kern w:val="0"/>
+          <w:sz w:val="18"/>
+          <w:szCs w:val="18"/>
+        </w:rPr>
+        <w:t xml:space="preserve"> </w:t>
+      </w:r>
+      <w:r>
+        <w:rPr>
+          <w:rFonts w:ascii="Consolas" w:eastAsia="Times New Roman" w:hAnsi="Consolas" w:cs="Times New Roman"/>
+          <w:color w:val="000000"/>
+          <w:kern w:val="0"/>
+          <w:sz w:val="18"/>
+          <w:szCs w:val="18"/>
+        </w:rPr>
+        <w:t>-</w:t>
+      </w:r>
+      <w:r>
+        <w:rPr>
+          <w:rFonts w:ascii="Consolas" w:eastAsia="Times New Roman" w:hAnsi="Consolas" w:cs="Times New Roman"/>
+          <w:color w:val="3B3B3B"/>
+          <w:kern w:val="0"/>
+          <w:sz w:val="18"/>
+          <w:szCs w:val="18"/>
+        </w:rPr>
+        <w:t xml:space="preserve"> </w:t>
+      </w:r>
+      <w:proofErr w:type="spellStart"/>
+      <w:r>
+        <w:rPr>
+          <w:rFonts w:ascii="Consolas" w:eastAsia="Times New Roman" w:hAnsi="Consolas" w:cs="Times New Roman"/>
+          <w:color w:val="001080"/>
+          <w:kern w:val="0"/>
+          <w:sz w:val="18"/>
+          <w:szCs w:val="18"/>
+        </w:rPr>
+        <w:t>D_i</w:t>
+      </w:r>
+      <w:proofErr w:type="spellEnd"/>
+    </w:p>
+    <w:p>
+      <w:pPr>
+        <w:bidi/>
+        <w:rPr>
+          <w:rFonts w:cs="Calibri"/>
+          <w:sz w:val="20"/>
+          <w:szCs w:val="20"/>
+          <w:rtl/>
+          <w:lang w:bidi="fa-IR"/>
+        </w:rPr>
+      </w:pPr>
+      <w:proofErr w:type="spellStart"/>
+      <w:r>
+        <w:rPr>
+          <w:rFonts w:cs="Calibri"/>
+          <w:sz w:val="20"/>
+          <w:szCs w:val="20"/>
+          <w:lang w:bidi="fa-IR"/>
+        </w:rPr>
+        <w:t>D_i</w:t>
+      </w:r>
+      <w:proofErr w:type="spellEnd"/>
+      <w:r>
+        <w:rPr>
+          <w:rFonts w:cs="Calibri" w:hint="cs"/>
+          <w:sz w:val="20"/>
+          <w:szCs w:val="20"/>
+          <w:rtl/>
+          <w:lang w:bidi="fa-IR"/>
+        </w:rPr>
+        <w:t xml:space="preserve"> مقدار آستانه را افزایش میدهد و باعث می شود </w:t>
+      </w:r>
+      <w:r>
+        <w:rPr>
+          <w:rFonts w:cs="Calibri" w:hint="cs"/>
+          <w:sz w:val="20"/>
+          <w:szCs w:val="20"/>
+          <w:rtl/>
+          <w:lang w:bidi="fa-IR"/>
+        </w:rPr>
+        <w:t xml:space="preserve">و اسپایک کردن نورون را به تعویق می اندازد که این به تعویق انداختن، اسپایک کردن نورون را سخت تر میکند و باعث افزایش معیار </w:t>
+      </w:r>
+      <w:r>
+        <w:rPr>
+          <w:rFonts w:cs="Calibri"/>
+          <w:sz w:val="20"/>
+          <w:szCs w:val="20"/>
+          <w:lang w:bidi="fa-IR"/>
+        </w:rPr>
+        <w:t>Sparsity</w:t>
+      </w:r>
+      <w:r>
+        <w:rPr>
+          <w:rFonts w:cs="Calibri" w:hint="cs"/>
+          <w:sz w:val="20"/>
+          <w:szCs w:val="20"/>
+          <w:rtl/>
+          <w:lang w:bidi="fa-IR"/>
+        </w:rPr>
+        <w:t xml:space="preserve"> میشود.</w:t>
+      </w:r>
+    </w:p>
+    <w:p>
+      <w:pPr>
+        <w:bidi/>
+        <w:rPr>
+          <w:rFonts w:cs="Calibri"/>
+          <w:sz w:val="20"/>
+          <w:szCs w:val="20"/>
+          <w:lang w:bidi="fa-IR"/>
+        </w:rPr>
+      </w:pPr>
+      <w:r>
+        <w:rPr>
+          <w:rFonts w:cs="Calibri" w:hint="cs"/>
+          <w:sz w:val="20"/>
+          <w:szCs w:val="20"/>
+          <w:rtl/>
+          <w:lang w:bidi="fa-IR"/>
+        </w:rPr>
+        <w:t xml:space="preserve">در زیر، درصدها نمایش دهنده </w:t>
+      </w:r>
+      <w:r>
+        <w:rPr>
+          <w:rFonts w:cs="Calibri"/>
+          <w:sz w:val="20"/>
+          <w:szCs w:val="20"/>
+          <w:lang w:bidi="fa-IR"/>
+        </w:rPr>
+        <w:t>Sparsity</w:t>
+      </w:r>
+      <w:r>
+        <w:rPr>
+          <w:rFonts w:cs="Calibri" w:hint="cs"/>
+          <w:sz w:val="20"/>
+          <w:szCs w:val="20"/>
+          <w:rtl/>
+          <w:lang w:bidi="fa-IR"/>
+        </w:rPr>
+        <w:t xml:space="preserve"> ، عدد اول داخل پرانتز نشان دهنده ی نورون هایی که در هر لایه اسپایک نمی کنند و عدد دوم داخل پرانتز، نشان دهنده ی تعداد نورون های آن لایه هستند. </w:t>
+      </w:r>
+    </w:p>
+    <w:p>
+      <w:pPr>
+        <w:bidi/>
+        <w:jc w:val="right"/>
+        <w:rPr>
+          <w:rFonts w:cs="Calibri"/>
+          <w:sz w:val="20"/>
+          <w:szCs w:val="20"/>
+          <w:lang w:bidi="fa-IR"/>
+        </w:rPr>
+      </w:pPr>
+      <w:r>
+        <w:rPr>
+          <w:rFonts w:cs="Calibri"/>
+          <w:sz w:val="20"/>
+          <w:szCs w:val="20"/>
+          <w:lang w:bidi="fa-IR"/>
+        </w:rPr>
+        <w:t>stages.0.0                            2.69% (silent: 784223/30105600)</w:t>
+      </w:r>
+    </w:p>
+    <w:p>
+      <w:pPr>
+        <w:bidi/>
+        <w:jc w:val="right"/>
+        <w:rPr>
+          <w:rFonts w:cs="Calibri"/>
+          <w:sz w:val="20"/>
+          <w:szCs w:val="20"/>
+          <w:lang w:bidi="fa-IR"/>
+        </w:rPr>
+      </w:pPr>
+      <w:r>
+        <w:rPr>
+          <w:rFonts w:cs="Calibri"/>
+          <w:sz w:val="20"/>
+          <w:szCs w:val="20"/>
+          <w:lang w:bidi="fa-IR"/>
+        </w:rPr>
+        <w:t>stages.0.1                            1.28% (silent: 377727/30105600)</w:t>
+      </w:r>
+    </w:p>
+    <w:p>
+      <w:pPr>
+        <w:bidi/>
+        <w:jc w:val="right"/>
+        <w:rPr>
+          <w:rFonts w:cs="Calibri"/>
+          <w:sz w:val="20"/>
+          <w:szCs w:val="20"/>
+          <w:lang w:bidi="fa-IR"/>
+        </w:rPr>
+      </w:pPr>
+      <w:r>
+        <w:rPr>
+          <w:rFonts w:cs="Calibri"/>
+          <w:sz w:val="20"/>
+          <w:szCs w:val="20"/>
+          <w:lang w:bidi="fa-IR"/>
+        </w:rPr>
+        <w:t>stages.0.2                            0.61% (silent: 184099/30105600)</w:t>
+      </w:r>
+    </w:p>
+    <w:p>
+      <w:pPr>
+        <w:bidi/>
+        <w:jc w:val="right"/>
+        <w:rPr>
+          <w:rFonts w:cs="Calibri"/>
+          <w:sz w:val="20"/>
+          <w:szCs w:val="20"/>
+          <w:lang w:bidi="fa-IR"/>
+        </w:rPr>
+      </w:pPr>
+      <w:r>
+        <w:rPr>
+          <w:rFonts w:cs="Calibri"/>
+          <w:sz w:val="20"/>
+          <w:szCs w:val="20"/>
+          <w:lang w:bidi="fa-IR"/>
+        </w:rPr>
+        <w:t>stages.1.0                           68.55% (silent: 10327032/15052800)</w:t>
+      </w:r>
+    </w:p>
+    <w:p>
+      <w:pPr>
+        <w:bidi/>
+        <w:jc w:val="right"/>
+        <w:rPr>
+          <w:rFonts w:cs="Calibri"/>
+          <w:sz w:val="20"/>
+          <w:szCs w:val="20"/>
+          <w:lang w:bidi="fa-IR"/>
+        </w:rPr>
+      </w:pPr>
+      <w:r>
+        <w:rPr>
+          <w:rFonts w:cs="Calibri"/>
+          <w:sz w:val="20"/>
+          <w:szCs w:val="20"/>
+          <w:lang w:bidi="fa-IR"/>
+        </w:rPr>
+        <w:t>stages.1.1                           55.59% (silent: 8382530/15052800)</w:t>
+      </w:r>
+    </w:p>
+    <w:p>
+      <w:pPr>
+        <w:bidi/>
+        <w:jc w:val="right"/>
+        <w:rPr>
+          <w:rFonts w:cs="Calibri"/>
+          <w:sz w:val="20"/>
+          <w:szCs w:val="20"/>
+          <w:lang w:bidi="fa-IR"/>
+        </w:rPr>
+      </w:pPr>
+      <w:r>
+        <w:rPr>
+          <w:rFonts w:cs="Calibri"/>
+          <w:sz w:val="20"/>
+          <w:szCs w:val="20"/>
+          <w:lang w:bidi="fa-IR"/>
+        </w:rPr>
+        <w:t>stages.1.2                           38.35% (silent: 5777719/15052800)</w:t>
+      </w:r>
+    </w:p>
+    <w:p>
+      <w:pPr>
+        <w:bidi/>
+        <w:jc w:val="right"/>
+        <w:rPr>
+          <w:rFonts w:cs="Calibri"/>
+          <w:sz w:val="20"/>
+          <w:szCs w:val="20"/>
+          <w:lang w:bidi="fa-IR"/>
+        </w:rPr>
+      </w:pPr>
+      <w:r>
+        <w:rPr>
+          <w:rFonts w:cs="Calibri"/>
+          <w:sz w:val="20"/>
+          <w:szCs w:val="20"/>
+          <w:lang w:bidi="fa-IR"/>
+        </w:rPr>
+        <w:t>stages.2.0                           72.24% (silent: 5458653/7526400)</w:t>
+      </w:r>
+    </w:p>
+    <w:p>
+      <w:pPr>
+        <w:bidi/>
+        <w:jc w:val="right"/>
+        <w:rPr>
+          <w:rFonts w:cs="Calibri"/>
+          <w:sz w:val="20"/>
+          <w:szCs w:val="20"/>
+          <w:lang w:bidi="fa-IR"/>
+        </w:rPr>
+      </w:pPr>
+      <w:r>
+        <w:rPr>
+          <w:rFonts w:cs="Calibri"/>
+          <w:sz w:val="20"/>
+          <w:szCs w:val="20"/>
+          <w:lang w:bidi="fa-IR"/>
+        </w:rPr>
+        <w:t>stages.2.1                           72.24% (silent: 5458653/7526400)</w:t>
+      </w:r>
+    </w:p>
+    <w:p>
+      <w:pPr>
+        <w:bidi/>
+        <w:jc w:val="right"/>
+        <w:rPr>
+          <w:rFonts w:cs="Calibri"/>
+          <w:sz w:val="20"/>
+          <w:szCs w:val="20"/>
+          <w:lang w:bidi="fa-IR"/>
+        </w:rPr>
+      </w:pPr>
+      <w:r>
+        <w:rPr>
+          <w:rFonts w:cs="Calibri"/>
+          <w:sz w:val="20"/>
+          <w:szCs w:val="20"/>
+          <w:lang w:bidi="fa-IR"/>
+        </w:rPr>
+        <w:t>stages.2.2                           72.21% (silent: 5456592/7526400)</w:t>
+      </w:r>
+    </w:p>
+    <w:p>
+      <w:pPr>
+        <w:bidi/>
+        <w:jc w:val="right"/>
+        <w:rPr>
+          <w:rFonts w:cs="Calibri"/>
+          <w:sz w:val="20"/>
+          <w:szCs w:val="20"/>
+          <w:lang w:bidi="fa-IR"/>
+        </w:rPr>
+      </w:pPr>
+      <w:r>
+        <w:rPr>
+          <w:rFonts w:cs="Calibri"/>
+          <w:sz w:val="20"/>
+          <w:szCs w:val="20"/>
+          <w:lang w:bidi="fa-IR"/>
+        </w:rPr>
+        <w:t>stages.2.3                           71.99% (silent: 5439340/7526400)</w:t>
+      </w:r>
+    </w:p>
+    <w:p>
+      <w:pPr>
+        <w:bidi/>
+        <w:jc w:val="right"/>
+        <w:rPr>
+          <w:rFonts w:cs="Calibri"/>
+          <w:sz w:val="20"/>
+          <w:szCs w:val="20"/>
+          <w:lang w:bidi="fa-IR"/>
+        </w:rPr>
+      </w:pPr>
+      <w:r>
+        <w:rPr>
+          <w:rFonts w:cs="Calibri"/>
+          <w:sz w:val="20"/>
+          <w:szCs w:val="20"/>
+          <w:lang w:bidi="fa-IR"/>
+        </w:rPr>
+        <w:t>stages.2.4                           71.83% (silent: 5427229/7526400)</w:t>
+      </w:r>
+    </w:p>
+    <w:p>
+      <w:pPr>
+        <w:bidi/>
+        <w:jc w:val="right"/>
+        <w:rPr>
+          <w:rFonts w:cs="Calibri"/>
+          <w:sz w:val="20"/>
+          <w:szCs w:val="20"/>
+          <w:lang w:bidi="fa-IR"/>
+        </w:rPr>
+      </w:pPr>
+      <w:r>
+        <w:rPr>
+          <w:rFonts w:cs="Calibri"/>
+          <w:sz w:val="20"/>
+          <w:szCs w:val="20"/>
+          <w:lang w:bidi="fa-IR"/>
+        </w:rPr>
+        <w:t>stages.2.5                           71.61% (silent: 5409830/7526400)</w:t>
+      </w:r>
+    </w:p>
+    <w:p>
+      <w:pPr>
+        <w:bidi/>
+        <w:jc w:val="right"/>
+        <w:rPr>
+          <w:rFonts w:cs="Calibri"/>
+          <w:sz w:val="20"/>
+          <w:szCs w:val="20"/>
+          <w:lang w:bidi="fa-IR"/>
+        </w:rPr>
+      </w:pPr>
+      <w:r>
+        <w:rPr>
+          <w:rFonts w:cs="Calibri"/>
+          <w:sz w:val="20"/>
+          <w:szCs w:val="20"/>
+          <w:lang w:bidi="fa-IR"/>
+        </w:rPr>
+        <w:t>stages.2.6                           71.48% (silent: 5400135/7526400)</w:t>
+      </w:r>
+    </w:p>
+    <w:p>
+      <w:pPr>
+        <w:bidi/>
+        <w:jc w:val="right"/>
+        <w:rPr>
+          <w:rFonts w:cs="Calibri"/>
+          <w:sz w:val="20"/>
+          <w:szCs w:val="20"/>
+          <w:lang w:bidi="fa-IR"/>
+        </w:rPr>
+      </w:pPr>
+      <w:r>
+        <w:rPr>
+          <w:rFonts w:cs="Calibri"/>
+          <w:sz w:val="20"/>
+          <w:szCs w:val="20"/>
+          <w:lang w:bidi="fa-IR"/>
+        </w:rPr>
+        <w:t>stages.2.7                           71.18% (silent: 5376841/7526400)</w:t>
+      </w:r>
+    </w:p>
+    <w:p>
+      <w:pPr>
+        <w:bidi/>
+        <w:jc w:val="right"/>
+        <w:rPr>
+          <w:rFonts w:cs="Calibri"/>
+          <w:sz w:val="20"/>
+          <w:szCs w:val="20"/>
+          <w:lang w:bidi="fa-IR"/>
+        </w:rPr>
+      </w:pPr>
+      <w:r>
+        <w:rPr>
+          <w:rFonts w:cs="Calibri"/>
+          <w:sz w:val="20"/>
+          <w:szCs w:val="20"/>
+          <w:lang w:bidi="fa-IR"/>
+        </w:rPr>
+        <w:t>stages.2.8                           62.28% (silent: 4704901/7526400)</w:t>
+      </w:r>
+    </w:p>
+    <w:p>
+      <w:pPr>
+        <w:bidi/>
+        <w:jc w:val="right"/>
+        <w:rPr>
+          <w:rFonts w:cs="Calibri"/>
+          <w:sz w:val="20"/>
+          <w:szCs w:val="20"/>
+          <w:lang w:bidi="fa-IR"/>
+        </w:rPr>
+      </w:pPr>
+      <w:r>
+        <w:rPr>
+          <w:rFonts w:cs="Calibri"/>
+          <w:sz w:val="20"/>
+          <w:szCs w:val="20"/>
+          <w:lang w:bidi="fa-IR"/>
+        </w:rPr>
+        <w:t>stages.3.0                           74.01% (silent: 2795987/3763200)</w:t>
+      </w:r>
+    </w:p>
+    <w:p>
+      <w:pPr>
+        <w:bidi/>
+        <w:jc w:val="right"/>
+        <w:rPr>
+          <w:rFonts w:cs="Calibri"/>
+          <w:sz w:val="20"/>
+          <w:szCs w:val="20"/>
+          <w:lang w:bidi="fa-IR"/>
+        </w:rPr>
+      </w:pPr>
+      <w:r>
+        <w:rPr>
+          <w:rFonts w:cs="Calibri"/>
+          <w:sz w:val="20"/>
+          <w:szCs w:val="20"/>
+          <w:lang w:bidi="fa-IR"/>
+        </w:rPr>
+        <w:t>stages.3.1                           70.33% (silent: 2656663/3763200)</w:t>
+      </w:r>
+    </w:p>
+    <w:p>
+      <w:pPr>
+        <w:bidi/>
+        <w:jc w:val="right"/>
+        <w:rPr>
+          <w:rFonts w:cs="Calibri"/>
+          <w:sz w:val="20"/>
+          <w:szCs w:val="20"/>
+          <w:lang w:bidi="fa-IR"/>
+        </w:rPr>
+      </w:pPr>
+      <w:r>
+        <w:rPr>
+          <w:rFonts w:cs="Calibri"/>
+          <w:sz w:val="20"/>
+          <w:szCs w:val="20"/>
+          <w:lang w:bidi="fa-IR"/>
+        </w:rPr>
+        <w:t>stages.3.2                           68.91% (silent: 2603794/3763200)</w:t>
+      </w:r>
+    </w:p>
+    <w:p>
+      <w:pPr>
+        <w:bidi/>
+        <w:jc w:val="right"/>
+        <w:rPr>
+          <w:rFonts w:cs="Calibri"/>
+          <w:sz w:val="20"/>
+          <w:szCs w:val="20"/>
+          <w:lang w:bidi="fa-IR"/>
+        </w:rPr>
+      </w:pPr>
+      <w:r>
+        <w:rPr>
+          <w:rFonts w:cs="Calibri"/>
+          <w:sz w:val="20"/>
+          <w:szCs w:val="20"/>
+          <w:lang w:bidi="fa-IR"/>
+        </w:rPr>
+        <w:t>downsample_layers.0.0                 0.00% (zeros: 0/4608)</w:t>
+      </w:r>
+    </w:p>
+    <w:p>
+      <w:pPr>
+        <w:bidi/>
+        <w:jc w:val="right"/>
+        <w:rPr>
+          <w:rFonts w:cs="Calibri"/>
+          <w:sz w:val="20"/>
+          <w:szCs w:val="20"/>
+          <w:lang w:bidi="fa-IR"/>
+        </w:rPr>
+      </w:pPr>
+      <w:r>
+        <w:rPr>
+          <w:rFonts w:cs="Calibri"/>
+          <w:sz w:val="20"/>
+          <w:szCs w:val="20"/>
+          <w:lang w:bidi="fa-IR"/>
+        </w:rPr>
+        <w:t>downsample_layers.1.0                 0.00% (zeros: 0/73728)</w:t>
+      </w:r>
+    </w:p>
+    <w:p>
+      <w:pPr>
+        <w:bidi/>
+        <w:jc w:val="right"/>
+        <w:rPr>
+          <w:rFonts w:cs="Calibri"/>
+          <w:sz w:val="20"/>
+          <w:szCs w:val="20"/>
+          <w:lang w:bidi="fa-IR"/>
+        </w:rPr>
+      </w:pPr>
+      <w:r>
+        <w:rPr>
+          <w:rFonts w:cs="Calibri"/>
+          <w:sz w:val="20"/>
+          <w:szCs w:val="20"/>
+          <w:lang w:bidi="fa-IR"/>
+        </w:rPr>
+        <w:t>downsample_layers.2.0                 0.00% (zeros: 0/294912)</w:t>
+      </w:r>
+    </w:p>
+    <w:p>
+      <w:pPr>
+        <w:bidi/>
+        <w:jc w:val="right"/>
+        <w:rPr>
+          <w:rFonts w:cs="Calibri"/>
+          <w:sz w:val="20"/>
+          <w:szCs w:val="20"/>
+          <w:lang w:bidi="fa-IR"/>
+        </w:rPr>
+      </w:pPr>
+      <w:r>
+        <w:rPr>
+          <w:rFonts w:cs="Calibri"/>
+          <w:sz w:val="20"/>
+          <w:szCs w:val="20"/>
+          <w:lang w:bidi="fa-IR"/>
+        </w:rPr>
+        <w:t>downsample_layers.3.0                 0.00% (zeros: 0/1179648)</w:t>
+      </w:r>
+    </w:p>
+    <w:p>
+      <w:pPr>
+        <w:bidi/>
+        <w:rPr>
+          <w:rFonts w:cs="Calibri"/>
+          <w:sz w:val="20"/>
+          <w:szCs w:val="20"/>
+          <w:lang w:bidi="fa-IR"/>
+        </w:rPr>
+      </w:pPr>
+    </w:p>
+    <w:p>
+      <w:pPr>
+        <w:bidi/>
+        <w:jc w:val="right"/>
+        <w:rPr>
+          <w:rFonts w:cs="Calibri"/>
+          <w:sz w:val="20"/>
+          <w:szCs w:val="20"/>
+          <w:lang w:bidi="fa-IR"/>
+        </w:rPr>
+      </w:pPr>
+      <w:r>
+        <w:rPr>
+          <w:rFonts w:cs="Calibri"/>
+          <w:sz w:val="20"/>
+          <w:szCs w:val="20"/>
+          <w:lang w:bidi="fa-IR"/>
+        </w:rPr>
+        <w:lastRenderedPageBreak/>
+        <w:t xml:space="preserve">Correct Global SNN Sparsity: </w:t>
+      </w:r>
+      <w:r>
+        <w:rPr>
+          <w:rFonts w:cs="Calibri"/>
+          <w:b/>
+          <w:bCs/>
+          <w:sz w:val="20"/>
+          <w:szCs w:val="20"/>
+          <w:lang w:bidi="fa-IR"/>
+        </w:rPr>
+        <w:t>38.</w:t>
+      </w:r>
+      <w:r>
+        <w:rPr>
+          <w:rFonts w:cs="Calibri"/>
+          <w:b/>
+          <w:bCs/>
+          <w:sz w:val="20"/>
+          <w:szCs w:val="20"/>
+          <w:lang w:bidi="fa-IR"/>
+        </w:rPr>
+        <w:t>01</w:t>
+      </w:r>
+      <w:r>
+        <w:rPr>
+          <w:rFonts w:cs="Calibri"/>
+          <w:b/>
+          <w:bCs/>
+          <w:sz w:val="20"/>
+          <w:szCs w:val="20"/>
+          <w:lang w:bidi="fa-IR"/>
+        </w:rPr>
+        <w:t>%</w:t>
+      </w:r>
+    </w:p>
+    <w:p>
+      <w:pPr>
+        <w:bidi/>
+        <w:jc w:val="right"/>
+        <w:rPr>
+          <w:rFonts w:cs="Calibri"/>
+          <w:sz w:val="20"/>
+          <w:szCs w:val="20"/>
+          <w:lang w:bidi="fa-IR"/>
+        </w:rPr>
+      </w:pPr>
+      <w:r>
+        <w:rPr>
+          <w:rFonts w:cs="Calibri"/>
+          <w:sz w:val="20"/>
+          <w:szCs w:val="20"/>
+          <w:rtl/>
+          <w:lang w:bidi="fa-IR"/>
+        </w:rPr>
+        <w:t>(</w:t>
+      </w:r>
+      <w:r>
+        <w:rPr>
+          <w:rFonts w:cs="Calibri"/>
+          <w:sz w:val="20"/>
+          <w:szCs w:val="20"/>
+          <w:lang w:bidi="fa-IR"/>
+        </w:rPr>
+        <w:t>Total silent/zero: 8217197623 / Total elements: 21520220320</w:t>
+      </w:r>
+      <w:r>
+        <w:rPr>
+          <w:rFonts w:cs="Calibri"/>
+          <w:sz w:val="20"/>
+          <w:szCs w:val="20"/>
+          <w:rtl/>
           <w:lang w:bidi="fa-IR"/>
         </w:rPr>
         <w:t>)</w:t>
       </w:r>
-      <w:r>
-        <w:rPr>
-          <w:rFonts w:cs="B Nazanin"/>
-          <w:sz w:val="20"/>
-          <w:szCs w:val="20"/>
-          <w:rtl/>
-          <w:lang w:bidi="fa-IR"/>
-        </w:rPr>
-        <w:br/>
-      </w:r>
-      <w:r>
-        <w:rPr>
-          <w:rFonts w:cs="B Nazanin" w:hint="cs"/>
-          <w:b/>
-          <w:bCs/>
-          <w:sz w:val="20"/>
-          <w:szCs w:val="20"/>
-          <w:rtl/>
-          <w:lang w:bidi="fa-IR"/>
-        </w:rPr>
-        <w:t>این کار باعث شد که دقت مدل به مقدار 95.96 درصد برسد</w:t>
-      </w:r>
-    </w:p>
-    <w:p>
-      <w:pPr>
-        <w:bidi/>
-        <w:rPr>
-          <w:rFonts w:cs="B Nazanin" w:hint="cs"/>
-          <w:sz w:val="20"/>
-          <w:szCs w:val="20"/>
-          <w:lang w:bidi="fa-IR"/>
-        </w:rPr>
-      </w:pPr>
     </w:p>
     <w:p>
       <w:pPr>
@@ -2008,18 +3509,568 @@
           <w:lang w:bidi="fa-IR"/>
         </w:rPr>
       </w:pPr>
+      <w:r>
+        <w:rPr>
+          <w:rFonts w:cs="Calibri"/>
+          <w:sz w:val="20"/>
+          <w:szCs w:val="20"/>
+          <w:rtl/>
+          <w:lang w:bidi="fa-IR"/>
+        </w:rPr>
+        <w:t>------------------------------------------------------------</w:t>
+      </w:r>
     </w:p>
     <w:p>
       <w:pPr>
         <w:bidi/>
         <w:jc w:val="right"/>
         <w:rPr>
+          <w:rFonts w:cs="Calibri"/>
+          <w:b/>
+          <w:bCs/>
+          <w:sz w:val="20"/>
+          <w:szCs w:val="20"/>
+          <w:rtl/>
+          <w:lang w:bidi="fa-IR"/>
+        </w:rPr>
+      </w:pPr>
+      <w:r>
+        <w:rPr>
+          <w:rFonts w:cs="Calibri"/>
+          <w:sz w:val="20"/>
+          <w:szCs w:val="20"/>
+          <w:lang w:bidi="fa-IR"/>
+        </w:rPr>
+        <w:t xml:space="preserve">Evaluation Accuracy: </w:t>
+      </w:r>
+      <w:r>
+        <w:rPr>
+          <w:rFonts w:cs="Calibri"/>
+          <w:b/>
+          <w:bCs/>
+          <w:sz w:val="20"/>
+          <w:szCs w:val="20"/>
+          <w:lang w:bidi="fa-IR"/>
+        </w:rPr>
+        <w:t>94.</w:t>
+      </w:r>
+      <w:r>
+        <w:rPr>
+          <w:rFonts w:cs="Calibri"/>
+          <w:b/>
+          <w:bCs/>
+          <w:sz w:val="20"/>
+          <w:szCs w:val="20"/>
+          <w:lang w:bidi="fa-IR"/>
+        </w:rPr>
+        <w:t>43</w:t>
+      </w:r>
+      <w:r>
+        <w:rPr>
+          <w:rFonts w:cs="Calibri"/>
+          <w:b/>
+          <w:bCs/>
+          <w:sz w:val="20"/>
+          <w:szCs w:val="20"/>
+          <w:lang w:bidi="fa-IR"/>
+        </w:rPr>
+        <w:t>%</w:t>
+      </w:r>
+    </w:p>
+    <w:p>
+      <w:pPr>
+        <w:bidi/>
+        <w:jc w:val="right"/>
+        <w:rPr>
+          <w:rFonts w:cs="Calibri"/>
+          <w:b/>
+          <w:bCs/>
+          <w:sz w:val="20"/>
+          <w:szCs w:val="20"/>
+          <w:rtl/>
+          <w:lang w:bidi="fa-IR"/>
+        </w:rPr>
+      </w:pPr>
+    </w:p>
+    <w:p>
+      <w:pPr>
+        <w:bidi/>
+        <w:jc w:val="right"/>
+        <w:rPr>
+          <w:rFonts w:cs="Calibri"/>
+          <w:b/>
+          <w:bCs/>
+          <w:sz w:val="20"/>
+          <w:szCs w:val="20"/>
+          <w:rtl/>
+          <w:lang w:bidi="fa-IR"/>
+        </w:rPr>
+      </w:pPr>
+    </w:p>
+    <w:p>
+      <w:pPr>
+        <w:bidi/>
+        <w:rPr>
           <w:rFonts w:cs="Calibri" w:hint="cs"/>
-          <w:sz w:val="20"/>
-          <w:szCs w:val="20"/>
-          <w:lang w:bidi="fa-IR"/>
-        </w:rPr>
-      </w:pPr>
+          <w:b/>
+          <w:bCs/>
+          <w:sz w:val="20"/>
+          <w:szCs w:val="20"/>
+          <w:rtl/>
+          <w:lang w:bidi="fa-IR"/>
+        </w:rPr>
+      </w:pPr>
+      <w:r>
+        <w:rPr>
+          <w:rFonts w:cs="Calibri" w:hint="cs"/>
+          <w:b/>
+          <w:bCs/>
+          <w:sz w:val="20"/>
+          <w:szCs w:val="20"/>
+          <w:rtl/>
+          <w:lang w:bidi="fa-IR"/>
+        </w:rPr>
+        <w:t xml:space="preserve">مقادیر متنوعی برای </w:t>
+      </w:r>
+      <w:r>
+        <w:rPr>
+          <w:rFonts w:cs="Calibri"/>
+          <w:b/>
+          <w:bCs/>
+          <w:sz w:val="20"/>
+          <w:szCs w:val="20"/>
+          <w:lang w:bidi="fa-IR"/>
+        </w:rPr>
+        <w:t xml:space="preserve">Sparsity  </w:t>
+      </w:r>
+      <w:r>
+        <w:rPr>
+          <w:rFonts w:cs="Calibri" w:hint="cs"/>
+          <w:b/>
+          <w:bCs/>
+          <w:sz w:val="20"/>
+          <w:szCs w:val="20"/>
+          <w:rtl/>
+          <w:lang w:bidi="fa-IR"/>
+        </w:rPr>
+        <w:t xml:space="preserve">و </w:t>
+      </w:r>
+      <w:r>
+        <w:rPr>
+          <w:rFonts w:cs="Calibri"/>
+          <w:b/>
+          <w:bCs/>
+          <w:sz w:val="20"/>
+          <w:szCs w:val="20"/>
+          <w:lang w:bidi="fa-IR"/>
+        </w:rPr>
+        <w:t>Accuracy</w:t>
+      </w:r>
+      <w:r>
+        <w:rPr>
+          <w:rFonts w:cs="Calibri" w:hint="cs"/>
+          <w:b/>
+          <w:bCs/>
+          <w:sz w:val="20"/>
+          <w:szCs w:val="20"/>
+          <w:rtl/>
+          <w:lang w:bidi="fa-IR"/>
+        </w:rPr>
+        <w:t xml:space="preserve"> بدست آوردم که </w:t>
+      </w:r>
+      <w:r>
+        <w:rPr>
+          <w:rFonts w:cs="Calibri"/>
+          <w:b/>
+          <w:bCs/>
+          <w:sz w:val="20"/>
+          <w:szCs w:val="20"/>
+          <w:lang w:bidi="fa-IR"/>
+        </w:rPr>
+        <w:t>Accuracy</w:t>
+      </w:r>
+      <w:r>
+        <w:rPr>
+          <w:rFonts w:cs="Calibri" w:hint="cs"/>
+          <w:b/>
+          <w:bCs/>
+          <w:sz w:val="20"/>
+          <w:szCs w:val="20"/>
+          <w:rtl/>
+          <w:lang w:bidi="fa-IR"/>
+        </w:rPr>
+        <w:t xml:space="preserve"> بین 93 تا</w:t>
+      </w:r>
+      <w:r>
+        <w:rPr>
+          <w:rFonts w:cs="Calibri"/>
+          <w:b/>
+          <w:bCs/>
+          <w:sz w:val="20"/>
+          <w:szCs w:val="20"/>
+          <w:lang w:bidi="fa-IR"/>
+        </w:rPr>
+        <w:t xml:space="preserve"> 94.4</w:t>
+      </w:r>
+      <w:r>
+        <w:rPr>
+          <w:rFonts w:cs="Calibri" w:hint="cs"/>
+          <w:b/>
+          <w:bCs/>
+          <w:sz w:val="20"/>
+          <w:szCs w:val="20"/>
+          <w:rtl/>
+          <w:lang w:bidi="fa-IR"/>
+        </w:rPr>
+        <w:t xml:space="preserve"> هست</w:t>
+      </w:r>
+      <w:r>
+        <w:rPr>
+          <w:rFonts w:cs="Calibri" w:hint="cs"/>
+          <w:b/>
+          <w:bCs/>
+          <w:sz w:val="20"/>
+          <w:szCs w:val="20"/>
+          <w:rtl/>
+          <w:lang w:bidi="fa-IR"/>
+        </w:rPr>
+        <w:t xml:space="preserve"> و </w:t>
+      </w:r>
+      <w:r>
+        <w:rPr>
+          <w:rFonts w:cs="Calibri"/>
+          <w:b/>
+          <w:bCs/>
+          <w:sz w:val="20"/>
+          <w:szCs w:val="20"/>
+          <w:lang w:bidi="fa-IR"/>
+        </w:rPr>
+        <w:t>Sparsity</w:t>
+      </w:r>
+      <w:r>
+        <w:rPr>
+          <w:rFonts w:cs="Calibri" w:hint="cs"/>
+          <w:b/>
+          <w:bCs/>
+          <w:sz w:val="20"/>
+          <w:szCs w:val="20"/>
+          <w:rtl/>
+          <w:lang w:bidi="fa-IR"/>
+        </w:rPr>
+        <w:t xml:space="preserve"> حوالی 38 است.</w:t>
+      </w:r>
+      <w:r>
+        <w:rPr>
+          <w:rFonts w:cs="Calibri" w:hint="cs"/>
+          <w:b/>
+          <w:bCs/>
+          <w:sz w:val="20"/>
+          <w:szCs w:val="20"/>
+          <w:rtl/>
+          <w:lang w:bidi="fa-IR"/>
+        </w:rPr>
+        <w:t xml:space="preserve">  فرایند آموزش</w:t>
+      </w:r>
+      <w:r>
+        <w:rPr>
+          <w:rFonts w:cs="Calibri" w:hint="cs"/>
+          <w:b/>
+          <w:bCs/>
+          <w:sz w:val="20"/>
+          <w:szCs w:val="20"/>
+          <w:rtl/>
+          <w:lang w:bidi="fa-IR"/>
+        </w:rPr>
+        <w:t xml:space="preserve"> را</w:t>
+      </w:r>
+      <w:r>
+        <w:rPr>
+          <w:rFonts w:cs="Calibri" w:hint="cs"/>
+          <w:b/>
+          <w:bCs/>
+          <w:sz w:val="20"/>
+          <w:szCs w:val="20"/>
+          <w:rtl/>
+          <w:lang w:bidi="fa-IR"/>
+        </w:rPr>
+        <w:t xml:space="preserve"> بعد 16 ساعت متوقف کردم و اگر متوقف نمیکردم یکم نتایج بهتری بدست می آمد.</w:t>
+      </w:r>
+    </w:p>
+    <w:p>
+      <w:pPr>
+        <w:bidi/>
+        <w:jc w:val="right"/>
+        <w:rPr>
+          <w:rFonts w:cs="Calibri"/>
+          <w:b/>
+          <w:bCs/>
+          <w:sz w:val="20"/>
+          <w:szCs w:val="20"/>
+          <w:rtl/>
+          <w:lang w:bidi="fa-IR"/>
+        </w:rPr>
+      </w:pPr>
+    </w:p>
+    <w:p>
+      <w:pPr>
+        <w:bidi/>
+        <w:jc w:val="right"/>
+        <w:rPr>
+          <w:rFonts w:cs="Calibri"/>
+          <w:b/>
+          <w:bCs/>
+          <w:sz w:val="20"/>
+          <w:szCs w:val="20"/>
+          <w:rtl/>
+          <w:lang w:bidi="fa-IR"/>
+        </w:rPr>
+      </w:pPr>
+    </w:p>
+    <w:p>
+      <w:pPr>
+        <w:bidi/>
+        <w:jc w:val="right"/>
+        <w:rPr>
+          <w:rFonts w:cs="Calibri"/>
+          <w:b/>
+          <w:bCs/>
+          <w:sz w:val="20"/>
+          <w:szCs w:val="20"/>
+          <w:rtl/>
+          <w:lang w:bidi="fa-IR"/>
+        </w:rPr>
+      </w:pPr>
+    </w:p>
+    <w:p>
+      <w:pPr>
+        <w:bidi/>
+        <w:jc w:val="right"/>
+        <w:rPr>
+          <w:rFonts w:cs="Calibri"/>
+          <w:b/>
+          <w:bCs/>
+          <w:sz w:val="20"/>
+          <w:szCs w:val="20"/>
+          <w:rtl/>
+          <w:lang w:bidi="fa-IR"/>
+        </w:rPr>
+      </w:pPr>
+    </w:p>
+    <w:p>
+      <w:pPr>
+        <w:bidi/>
+        <w:rPr>
+          <w:rFonts w:cs="Calibri"/>
+          <w:b/>
+          <w:bCs/>
+          <w:sz w:val="20"/>
+          <w:szCs w:val="20"/>
+          <w:rtl/>
+          <w:lang w:bidi="fa-IR"/>
+        </w:rPr>
+      </w:pPr>
+      <w:r>
+        <w:rPr>
+          <w:rFonts w:cs="Calibri" w:hint="cs"/>
+          <w:b/>
+          <w:bCs/>
+          <w:sz w:val="20"/>
+          <w:szCs w:val="20"/>
+          <w:highlight w:val="magenta"/>
+          <w:rtl/>
+          <w:lang w:bidi="fa-IR"/>
+        </w:rPr>
+        <w:t xml:space="preserve">در تصویر زیر </w:t>
+      </w:r>
+      <w:r>
+        <w:rPr>
+          <w:rFonts w:cs="Calibri" w:hint="cs"/>
+          <w:b/>
+          <w:bCs/>
+          <w:sz w:val="20"/>
+          <w:szCs w:val="20"/>
+          <w:highlight w:val="magenta"/>
+          <w:rtl/>
+          <w:lang w:bidi="fa-IR"/>
+        </w:rPr>
+        <w:t xml:space="preserve">مقدار </w:t>
+      </w:r>
+      <w:r>
+        <w:rPr>
+          <w:rFonts w:cs="Calibri"/>
+          <w:b/>
+          <w:bCs/>
+          <w:sz w:val="20"/>
+          <w:szCs w:val="20"/>
+          <w:highlight w:val="magenta"/>
+          <w:lang w:bidi="fa-IR"/>
+        </w:rPr>
+        <w:t xml:space="preserve">Sparsity </w:t>
+      </w:r>
+      <w:r>
+        <w:rPr>
+          <w:rFonts w:cs="Calibri" w:hint="cs"/>
+          <w:b/>
+          <w:bCs/>
+          <w:sz w:val="20"/>
+          <w:szCs w:val="20"/>
+          <w:highlight w:val="magenta"/>
+          <w:rtl/>
+          <w:lang w:bidi="fa-IR"/>
+        </w:rPr>
+        <w:t xml:space="preserve"> در سه لایه اول به شدت کم هست و جای کار دارد</w:t>
+      </w:r>
+      <w:r>
+        <w:rPr>
+          <w:rFonts w:cs="Calibri"/>
+          <w:b/>
+          <w:bCs/>
+          <w:sz w:val="20"/>
+          <w:szCs w:val="20"/>
+          <w:lang w:bidi="fa-IR"/>
+        </w:rPr>
+        <w:t xml:space="preserve"> </w:t>
+      </w:r>
+      <w:r>
+        <w:rPr>
+          <w:rFonts w:cs="Calibri" w:hint="cs"/>
+          <w:b/>
+          <w:bCs/>
+          <w:sz w:val="20"/>
+          <w:szCs w:val="20"/>
+          <w:rtl/>
+          <w:lang w:bidi="fa-IR"/>
+        </w:rPr>
+        <w:t>(با کادر آبی مشخص شده است)</w:t>
+      </w:r>
+    </w:p>
+    <w:p>
+      <w:pPr>
+        <w:bidi/>
+        <w:rPr>
+          <w:rFonts w:cs="Calibri" w:hint="cs"/>
+          <w:b/>
+          <w:bCs/>
+          <w:sz w:val="20"/>
+          <w:szCs w:val="20"/>
+          <w:lang w:bidi="fa-IR"/>
+        </w:rPr>
+      </w:pPr>
+      <w:r>
+        <w:rPr>
+          <w:rFonts w:cs="Calibri" w:hint="cs"/>
+          <w:b/>
+          <w:bCs/>
+          <w:sz w:val="20"/>
+          <w:szCs w:val="20"/>
+          <w:rtl/>
+          <w:lang w:bidi="fa-IR"/>
+        </w:rPr>
+        <w:t xml:space="preserve">چهار لایه ای که مقدار </w:t>
+      </w:r>
+      <w:r>
+        <w:rPr>
+          <w:rFonts w:cs="Calibri"/>
+          <w:b/>
+          <w:bCs/>
+          <w:sz w:val="20"/>
+          <w:szCs w:val="20"/>
+          <w:lang w:bidi="fa-IR"/>
+        </w:rPr>
+        <w:t>Sparsity</w:t>
+      </w:r>
+      <w:r>
+        <w:rPr>
+          <w:rFonts w:cs="Calibri" w:hint="cs"/>
+          <w:b/>
+          <w:bCs/>
+          <w:sz w:val="20"/>
+          <w:szCs w:val="20"/>
+          <w:rtl/>
+          <w:lang w:bidi="fa-IR"/>
+        </w:rPr>
+        <w:t xml:space="preserve"> آن برابر صفر است جای کار دارد.</w:t>
+      </w:r>
+    </w:p>
+    <w:p>
+      <w:pPr>
+        <w:bidi/>
+        <w:jc w:val="right"/>
+        <w:rPr>
+          <w:rFonts w:cs="Calibri"/>
+          <w:b/>
+          <w:bCs/>
+          <w:sz w:val="20"/>
+          <w:szCs w:val="20"/>
+          <w:lang w:bidi="fa-IR"/>
+        </w:rPr>
+      </w:pPr>
+    </w:p>
+    <w:p>
+      <w:pPr>
+        <w:bidi/>
+        <w:jc w:val="right"/>
+        <w:rPr>
+          <w:rFonts w:cs="Calibri"/>
+          <w:sz w:val="20"/>
+          <w:szCs w:val="20"/>
+          <w:lang w:bidi="fa-IR"/>
+        </w:rPr>
+      </w:pPr>
+      <w:r>
+        <w:rPr>
+          <w:noProof/>
+        </w:rPr>
+        <w:lastRenderedPageBreak/>
+        <w:drawing>
+          <wp:inline distT="0" distB="0" distL="0" distR="0" wp14:anchorId="48A90135" wp14:editId="7F7EEBAC">
+            <wp:extent cx="6822374" cy="8917596"/>
+            <wp:effectExtent l="0" t="0" r="0" b="0"/>
+            <wp:docPr id="471307265" name="Picture 3"/>
+            <wp:cNvGraphicFramePr>
+              <a:graphicFrameLocks xmlns:a="http://schemas.openxmlformats.org/drawingml/2006/main" noChangeAspect="1"/>
+            </wp:cNvGraphicFramePr>
+            <a:graphic xmlns:a="http://schemas.openxmlformats.org/drawingml/2006/main">
+              <a:graphicData uri="http://schemas.openxmlformats.org/drawingml/2006/picture">
+                <pic:pic xmlns:pic="http://schemas.openxmlformats.org/drawingml/2006/picture">
+                  <pic:nvPicPr>
+                    <pic:cNvPr id="0" name="Picture 6"/>
+                    <pic:cNvPicPr>
+                      <a:picLocks noChangeAspect="1" noChangeArrowheads="1"/>
+                    </pic:cNvPicPr>
+                  </pic:nvPicPr>
+                  <pic:blipFill>
+                    <a:blip r:embed="rId7">
+                      <a:extLst>
+                        <a:ext uri="{28A0092B-C50C-407E-A947-70E740481C1C}">
+                          <a14:useLocalDpi xmlns:a14="http://schemas.microsoft.com/office/drawing/2010/main" val="0"/>
+                        </a:ext>
+                      </a:extLst>
+                    </a:blip>
+                    <a:srcRect/>
+                    <a:stretch>
+                      <a:fillRect/>
+                    </a:stretch>
+                  </pic:blipFill>
+                  <pic:spPr bwMode="auto">
+                    <a:xfrm>
+                      <a:off x="0" y="0"/>
+                      <a:ext cx="6825105" cy="8921166"/>
+                    </a:xfrm>
+                    <a:prstGeom prst="rect">
+                      <a:avLst/>
+                    </a:prstGeom>
+                    <a:noFill/>
+                    <a:ln>
+                      <a:noFill/>
+                    </a:ln>
+                  </pic:spPr>
+                </pic:pic>
+              </a:graphicData>
+            </a:graphic>
+          </wp:inline>
+        </w:drawing>
+      </w:r>
     </w:p>
     <w:sectPr>
       <w:pgSz w:w="12240" w:h="15840"/>
@@ -2634,6 +4685,7 @@
   <w:style w:type="character" w:default="1" w:styleId="DefaultParagraphFont">
     <w:name w:val="Default Paragraph Font"/>
     <w:uiPriority w:val="1"/>
+    <w:semiHidden/>
     <w:unhideWhenUsed/>
   </w:style>
   <w:style w:type="table" w:default="1" w:styleId="TableNormal">

</xml_diff>